<commit_message>
lab9: Complete subtask 2 for exercise 1
</commit_message>
<xml_diff>
--- a/lab9/lab9_report.docx
+++ b/lab9/lab9_report.docx
@@ -259,6 +259,7 @@
       <w:r>
         <w:rPr>
           <w:rFonts w:ascii="Times New Roman" w:hAnsi="Times New Roman" w:cs="Times New Roman"/>
+          <w:noProof/>
           <w:lang w:val="en-GB" w:eastAsia="nb-NO"/>
         </w:rPr>
         <w:drawing>
@@ -342,6 +343,60 @@
           <w:szCs w:val="28"/>
           <w:lang w:val="en-GB" w:eastAsia="nb-NO"/>
         </w:rPr>
+        <w:lastRenderedPageBreak/>
+        <w:drawing>
+          <wp:inline distT="0" distB="0" distL="0" distR="0" wp14:anchorId="135D381A" wp14:editId="7A3DF75D">
+            <wp:extent cx="3839111" cy="5849166"/>
+            <wp:effectExtent l="0" t="0" r="9525" b="0"/>
+            <wp:docPr id="511052028" name="Bilde 1"/>
+            <wp:cNvGraphicFramePr>
+              <a:graphicFrameLocks xmlns:a="http://schemas.openxmlformats.org/drawingml/2006/main" noChangeAspect="1"/>
+            </wp:cNvGraphicFramePr>
+            <a:graphic xmlns:a="http://schemas.openxmlformats.org/drawingml/2006/main">
+              <a:graphicData uri="http://schemas.openxmlformats.org/drawingml/2006/picture">
+                <pic:pic xmlns:pic="http://schemas.openxmlformats.org/drawingml/2006/picture">
+                  <pic:nvPicPr>
+                    <pic:cNvPr id="511052028" name=""/>
+                    <pic:cNvPicPr/>
+                  </pic:nvPicPr>
+                  <pic:blipFill>
+                    <a:blip r:embed="rId8"/>
+                    <a:stretch>
+                      <a:fillRect/>
+                    </a:stretch>
+                  </pic:blipFill>
+                  <pic:spPr>
+                    <a:xfrm>
+                      <a:off x="0" y="0"/>
+                      <a:ext cx="3839111" cy="5849166"/>
+                    </a:xfrm>
+                    <a:prstGeom prst="rect">
+                      <a:avLst/>
+                    </a:prstGeom>
+                  </pic:spPr>
+                </pic:pic>
+              </a:graphicData>
+            </a:graphic>
+          </wp:inline>
+        </w:drawing>
+      </w:r>
+    </w:p>
+    <w:p>
+      <w:pPr>
+        <w:rPr>
+          <w:rFonts w:ascii="Times New Roman" w:hAnsi="Times New Roman" w:cs="Times New Roman"/>
+          <w:sz w:val="28"/>
+          <w:szCs w:val="28"/>
+          <w:lang w:val="en-GB" w:eastAsia="nb-NO"/>
+        </w:rPr>
+      </w:pPr>
+      <w:r>
+        <w:rPr>
+          <w:rFonts w:ascii="Times New Roman" w:hAnsi="Times New Roman" w:cs="Times New Roman"/>
+          <w:sz w:val="28"/>
+          <w:szCs w:val="28"/>
+          <w:lang w:val="en-GB" w:eastAsia="nb-NO"/>
+        </w:rPr>
         <w:t>Subtask 3:</w:t>
       </w:r>
     </w:p>
@@ -431,8 +486,8 @@
       </w:pPr>
     </w:p>
     <w:sectPr>
-      <w:headerReference w:type="even" r:id="rId8"/>
-      <w:headerReference w:type="default" r:id="rId9"/>
+      <w:headerReference w:type="even" r:id="rId9"/>
+      <w:headerReference w:type="default" r:id="rId10"/>
       <w:pgSz w:w="11906" w:h="16838"/>
       <w:pgMar w:top="1417" w:right="1417" w:bottom="1417" w:left="1417" w:header="708" w:footer="708" w:gutter="0"/>
       <w:cols w:space="708"/>
@@ -505,6 +560,11 @@
         <w:docPartUnique/>
       </w:docPartObj>
     </w:sdtPr>
+    <w:sdtEndPr>
+      <w:rPr>
+        <w:rStyle w:val="Sidetall"/>
+      </w:rPr>
+    </w:sdtEndPr>
     <w:sdtContent>
       <w:p>
         <w:pPr>
@@ -563,6 +623,11 @@
         <w:docPartUnique/>
       </w:docPartObj>
     </w:sdtPr>
+    <w:sdtEndPr>
+      <w:rPr>
+        <w:rStyle w:val="Sidetall"/>
+      </w:rPr>
+    </w:sdtEndPr>
     <w:sdtContent>
       <w:p>
         <w:pPr>

</xml_diff>

<commit_message>
lab9: finish exercise 1
</commit_message>
<xml_diff>
--- a/lab9/lab9_report.docx
+++ b/lab9/lab9_report.docx
@@ -339,6 +339,7 @@
       <w:r>
         <w:rPr>
           <w:rFonts w:ascii="Times New Roman" w:hAnsi="Times New Roman" w:cs="Times New Roman"/>
+          <w:noProof/>
           <w:sz w:val="28"/>
           <w:szCs w:val="28"/>
           <w:lang w:val="en-GB" w:eastAsia="nb-NO"/>
@@ -416,7 +417,133 @@
           <w:szCs w:val="28"/>
           <w:lang w:val="en-GB" w:eastAsia="nb-NO"/>
         </w:rPr>
+        <w:drawing>
+          <wp:inline distT="0" distB="0" distL="0" distR="0" wp14:anchorId="5DC8CCC8" wp14:editId="7B64F310">
+            <wp:extent cx="5575300" cy="1270000"/>
+            <wp:effectExtent l="0" t="0" r="0" b="0"/>
+            <wp:docPr id="223144265" name="Bilde 1"/>
+            <wp:cNvGraphicFramePr>
+              <a:graphicFrameLocks xmlns:a="http://schemas.openxmlformats.org/drawingml/2006/main" noChangeAspect="1"/>
+            </wp:cNvGraphicFramePr>
+            <a:graphic xmlns:a="http://schemas.openxmlformats.org/drawingml/2006/main">
+              <a:graphicData uri="http://schemas.openxmlformats.org/drawingml/2006/picture">
+                <pic:pic xmlns:pic="http://schemas.openxmlformats.org/drawingml/2006/picture">
+                  <pic:nvPicPr>
+                    <pic:cNvPr id="223144265" name=""/>
+                    <pic:cNvPicPr/>
+                  </pic:nvPicPr>
+                  <pic:blipFill>
+                    <a:blip r:embed="rId9"/>
+                    <a:stretch>
+                      <a:fillRect/>
+                    </a:stretch>
+                  </pic:blipFill>
+                  <pic:spPr>
+                    <a:xfrm>
+                      <a:off x="0" y="0"/>
+                      <a:ext cx="5575300" cy="1270000"/>
+                    </a:xfrm>
+                    <a:prstGeom prst="rect">
+                      <a:avLst/>
+                    </a:prstGeom>
+                  </pic:spPr>
+                </pic:pic>
+              </a:graphicData>
+            </a:graphic>
+          </wp:inline>
+        </w:drawing>
+      </w:r>
+    </w:p>
+    <w:p>
+      <w:pPr>
+        <w:rPr>
+          <w:rFonts w:ascii="Times New Roman" w:hAnsi="Times New Roman" w:cs="Times New Roman"/>
+          <w:sz w:val="28"/>
+          <w:szCs w:val="28"/>
+          <w:lang w:val="en-GB" w:eastAsia="nb-NO"/>
+        </w:rPr>
+      </w:pPr>
+      <w:r>
+        <w:rPr>
+          <w:rFonts w:ascii="Times New Roman" w:hAnsi="Times New Roman" w:cs="Times New Roman"/>
+          <w:sz w:val="28"/>
+          <w:szCs w:val="28"/>
+          <w:lang w:val="en-GB" w:eastAsia="nb-NO"/>
+        </w:rPr>
         <w:t>Subtask 4:</w:t>
+      </w:r>
+    </w:p>
+    <w:p>
+      <w:pPr>
+        <w:rPr>
+          <w:rFonts w:ascii="Times New Roman" w:hAnsi="Times New Roman" w:cs="Times New Roman"/>
+          <w:sz w:val="28"/>
+          <w:szCs w:val="28"/>
+          <w:lang w:val="en-GB" w:eastAsia="nb-NO"/>
+        </w:rPr>
+      </w:pPr>
+      <w:r>
+        <w:rPr>
+          <w:rFonts w:ascii="Times New Roman" w:hAnsi="Times New Roman" w:cs="Times New Roman"/>
+          <w:sz w:val="28"/>
+          <w:szCs w:val="28"/>
+          <w:lang w:val="en-GB" w:eastAsia="nb-NO"/>
+        </w:rPr>
+        <w:lastRenderedPageBreak/>
+        <w:drawing>
+          <wp:inline distT="0" distB="0" distL="0" distR="0" wp14:anchorId="4FA93F0A" wp14:editId="2AE44803">
+            <wp:extent cx="5168900" cy="1358900"/>
+            <wp:effectExtent l="0" t="0" r="0" b="0"/>
+            <wp:docPr id="1721369523" name="Bilde 1"/>
+            <wp:cNvGraphicFramePr>
+              <a:graphicFrameLocks xmlns:a="http://schemas.openxmlformats.org/drawingml/2006/main" noChangeAspect="1"/>
+            </wp:cNvGraphicFramePr>
+            <a:graphic xmlns:a="http://schemas.openxmlformats.org/drawingml/2006/main">
+              <a:graphicData uri="http://schemas.openxmlformats.org/drawingml/2006/picture">
+                <pic:pic xmlns:pic="http://schemas.openxmlformats.org/drawingml/2006/picture">
+                  <pic:nvPicPr>
+                    <pic:cNvPr id="1721369523" name=""/>
+                    <pic:cNvPicPr/>
+                  </pic:nvPicPr>
+                  <pic:blipFill>
+                    <a:blip r:embed="rId10"/>
+                    <a:stretch>
+                      <a:fillRect/>
+                    </a:stretch>
+                  </pic:blipFill>
+                  <pic:spPr>
+                    <a:xfrm>
+                      <a:off x="0" y="0"/>
+                      <a:ext cx="5168900" cy="1358900"/>
+                    </a:xfrm>
+                    <a:prstGeom prst="rect">
+                      <a:avLst/>
+                    </a:prstGeom>
+                  </pic:spPr>
+                </pic:pic>
+              </a:graphicData>
+            </a:graphic>
+          </wp:inline>
+        </w:drawing>
+      </w:r>
+    </w:p>
+    <w:p>
+      <w:pPr>
+        <w:rPr>
+          <w:rFonts w:ascii="Times New Roman" w:hAnsi="Times New Roman" w:cs="Times New Roman"/>
+          <w:sz w:val="28"/>
+          <w:szCs w:val="28"/>
+          <w:lang w:val="en-GB" w:eastAsia="nb-NO"/>
+        </w:rPr>
+      </w:pPr>
+      <w:r>
+        <w:rPr>
+          <w:rFonts w:ascii="Times New Roman" w:hAnsi="Times New Roman" w:cs="Times New Roman"/>
+          <w:sz w:val="28"/>
+          <w:szCs w:val="28"/>
+          <w:lang w:val="en-GB" w:eastAsia="nb-NO"/>
+        </w:rPr>
+        <w:t>With RUNS = 20, the per-run speedup converges tightly to ~0.17–0.23, giving a stable average speedup of ~0.21–0.23.</w:t>
       </w:r>
     </w:p>
     <w:p>
@@ -480,14 +607,140 @@
     <w:p>
       <w:pPr>
         <w:rPr>
-          <w:rFonts w:ascii="Times New Roman" w:hAnsi="Times New Roman" w:cs="Times New Roman"/>
+          <w:lang w:val="en-GB" w:eastAsia="nb-NO"/>
+        </w:rPr>
+      </w:pPr>
+      <w:r>
+        <w:rPr>
+          <w:lang w:val="en-GB" w:eastAsia="nb-NO"/>
+        </w:rPr>
+        <w:t>Subtask 1:</w:t>
+      </w:r>
+    </w:p>
+    <w:p>
+      <w:pPr>
+        <w:rPr>
+          <w:lang w:val="en-GB" w:eastAsia="nb-NO"/>
+        </w:rPr>
+      </w:pPr>
+      <w:r>
+        <w:rPr>
+          <w:lang w:val="en-GB" w:eastAsia="nb-NO"/>
+        </w:rPr>
+        <w:t xml:space="preserve">Subtask </w:t>
+      </w:r>
+      <w:r>
+        <w:rPr>
+          <w:lang w:val="en-GB" w:eastAsia="nb-NO"/>
+        </w:rPr>
+        <w:t>2</w:t>
+      </w:r>
+      <w:r>
+        <w:rPr>
+          <w:lang w:val="en-GB" w:eastAsia="nb-NO"/>
+        </w:rPr>
+        <w:t>:</w:t>
+      </w:r>
+    </w:p>
+    <w:p>
+      <w:pPr>
+        <w:rPr>
+          <w:lang w:val="en-GB" w:eastAsia="nb-NO"/>
+        </w:rPr>
+      </w:pPr>
+      <w:r>
+        <w:rPr>
+          <w:lang w:val="en-GB" w:eastAsia="nb-NO"/>
+        </w:rPr>
+        <w:t xml:space="preserve">Subtask </w:t>
+      </w:r>
+      <w:r>
+        <w:rPr>
+          <w:lang w:val="en-GB" w:eastAsia="nb-NO"/>
+        </w:rPr>
+        <w:t>3</w:t>
+      </w:r>
+      <w:r>
+        <w:rPr>
+          <w:lang w:val="en-GB" w:eastAsia="nb-NO"/>
+        </w:rPr>
+        <w:t>:</w:t>
+      </w:r>
+    </w:p>
+    <w:p>
+      <w:pPr>
+        <w:rPr>
+          <w:lang w:val="en-GB" w:eastAsia="nb-NO"/>
+        </w:rPr>
+      </w:pPr>
+      <w:r>
+        <w:rPr>
+          <w:lang w:val="en-GB" w:eastAsia="nb-NO"/>
+        </w:rPr>
+        <w:t xml:space="preserve">Subtask </w:t>
+      </w:r>
+      <w:r>
+        <w:rPr>
+          <w:lang w:val="en-GB" w:eastAsia="nb-NO"/>
+        </w:rPr>
+        <w:t>4</w:t>
+      </w:r>
+      <w:r>
+        <w:rPr>
+          <w:lang w:val="en-GB" w:eastAsia="nb-NO"/>
+        </w:rPr>
+        <w:t>:</w:t>
+      </w:r>
+    </w:p>
+    <w:p>
+      <w:pPr>
+        <w:rPr>
+          <w:lang w:val="en-GB" w:eastAsia="nb-NO"/>
+        </w:rPr>
+      </w:pPr>
+      <w:r>
+        <w:rPr>
+          <w:lang w:val="en-GB" w:eastAsia="nb-NO"/>
+        </w:rPr>
+        <w:t xml:space="preserve">Subtask </w:t>
+      </w:r>
+      <w:r>
+        <w:rPr>
+          <w:lang w:val="en-GB" w:eastAsia="nb-NO"/>
+        </w:rPr>
+        <w:t>5</w:t>
+      </w:r>
+      <w:r>
+        <w:rPr>
+          <w:lang w:val="en-GB" w:eastAsia="nb-NO"/>
+        </w:rPr>
+        <w:t>:</w:t>
+      </w:r>
+    </w:p>
+    <w:p>
+      <w:pPr>
+        <w:rPr>
+          <w:lang w:val="en-GB" w:eastAsia="nb-NO"/>
+        </w:rPr>
+      </w:pPr>
+    </w:p>
+    <w:p>
+      <w:pPr>
+        <w:rPr>
+          <w:lang w:val="en-GB" w:eastAsia="nb-NO"/>
+        </w:rPr>
+      </w:pPr>
+    </w:p>
+    <w:p>
+      <w:pPr>
+        <w:rPr>
           <w:lang w:val="en-GB" w:eastAsia="nb-NO"/>
         </w:rPr>
       </w:pPr>
     </w:p>
     <w:sectPr>
-      <w:headerReference w:type="even" r:id="rId9"/>
-      <w:headerReference w:type="default" r:id="rId10"/>
+      <w:headerReference w:type="even" r:id="rId11"/>
+      <w:headerReference w:type="default" r:id="rId12"/>
       <w:pgSz w:w="11906" w:h="16838"/>
       <w:pgMar w:top="1417" w:right="1417" w:bottom="1417" w:left="1417" w:header="708" w:footer="708" w:gutter="0"/>
       <w:cols w:space="708"/>
@@ -560,11 +813,6 @@
         <w:docPartUnique/>
       </w:docPartObj>
     </w:sdtPr>
-    <w:sdtEndPr>
-      <w:rPr>
-        <w:rStyle w:val="Sidetall"/>
-      </w:rPr>
-    </w:sdtEndPr>
     <w:sdtContent>
       <w:p>
         <w:pPr>
@@ -623,11 +871,6 @@
         <w:docPartUnique/>
       </w:docPartObj>
     </w:sdtPr>
-    <w:sdtEndPr>
-      <w:rPr>
-        <w:rStyle w:val="Sidetall"/>
-      </w:rPr>
-    </w:sdtEndPr>
     <w:sdtContent>
       <w:p>
         <w:pPr>

</xml_diff>